<commit_message>
docs(decisiones): aclara P5 (rondas de cambios = diseno, no cotizacion)
El dueno entendio "rondas de cambios" como cambios a la cotizacion. Reformula la
pregunta 5 para dejar explicito que son cambios al DISENO (modelado/renders) una
vez mostrado al cliente, con ejemplos concretos. Actualiza el .md canonico y
regenera el .docx.

Co-Authored-By: Claude Opus 4.8 <noreply@anthropic.com>
</commit_message>
<xml_diff>
--- a/docs/decisiones/decisiones-pendientes-dueno.docx
+++ b/docs/decisiones/decisiones-pendientes-dueno.docx
@@ -544,7 +544,7 @@
           <w:sz w:val="26"/>
           <w:szCs w:val="26"/>
         </w:rPr>
-        <w:t xml:space="preserve">5. ¿Hay tope de rondas de cambios?</w:t>
+        <w:t xml:space="preserve">5. En el diseño (NO en la cotización): ¿hay un tope de rondas de cambios?</w:t>
       </w:r>
       <w:r>
         <w:rPr>
@@ -566,7 +566,7 @@
           <w:sz w:val="22"/>
           <w:szCs w:val="22"/>
         </w:rPr>
-        <w:t xml:space="preserve">Hoy el cliente puede pedir cambios ilimitados.</w:t>
+        <w:t xml:space="preserve">Aclaramos porque se presta a confusión: hablamos de los cambios al DISEÑO, no a la cotización. Es cuando el diseñador ya le mostró al cliente el modelado o los renders y el cliente pide ajustes ("córrelo a la izquierda", "cámbialo de color", "agrégale una gaveta"). Hoy el cliente puede pedir cambios ilimitados sin costo extra.</w:t>
       </w:r>
     </w:p>
     <w:p>
@@ -593,7 +593,7 @@
           <w:sz w:val="22"/>
           <w:szCs w:val="22"/>
         </w:rPr>
-        <w:t xml:space="preserve">define cuándo le cobrás un ajuste extra.</w:t>
+        <w:t xml:space="preserve">define a partir de cuántos ajustes le empezás a cobrar un extra.</w:t>
       </w:r>
     </w:p>
     <w:p>
@@ -617,7 +617,7 @@
           <w:sz w:val="22"/>
           <w:szCs w:val="22"/>
         </w:rPr>
-        <w:t xml:space="preserve">¿Ilimitadas, o un tope antes de cobrar? Si hay tope: ¿cuántas rondas, y se cuentan por etapa (modelado y render por separado) o sobre el diseño completo?</w:t>
+        <w:t xml:space="preserve">¿Ilimitadas, o un tope (por ejemplo 2 o 3) antes de cobrar? Si hay tope: ¿cuántas rondas, y se cuentan por etapa (modelado y renders por separado) o sobre el diseño completo?</w:t>
       </w:r>
     </w:p>
     <w:p>

</xml_diff>